<commit_message>
docs: rebuild all PDFs/DOCX and refresh screenshots for v0.2.3
Regenerates every PDF/DOCX from the corrected source markdown, and fixes a
real bug caught during this rebuild: the doc build script's cover-page
template had "0.1.0" hardcoded as the Version stamp, so every previously
published PDF showed the wrong version regardless of the actual release.
Now driven by a single VERSION constant alongside the existing TODAY one.

Screenshots (18 refreshed + 1 new) were recaptured live against the
current v0.2.3 build rather than carried over from v0.2.2 -- notably the
IOC Providers tab and Provider Health page now correctly show all 18
providers including urlscan.io and Google Safe Browsing, and a new
relationship-graph-list-view.png documents the "View as list" toggle fix.
</commit_message>
<xml_diff>
--- a/documentation/HORIZON_GRID_ADMIN_GUIDE.docx
+++ b/documentation/HORIZON_GRID_ADMIN_GUIDE.docx
@@ -70,7 +70,7 @@
       </w:r>
       <w:r>
         <w:rPr/>
-        <w:t xml:space="preserve"> 0.1.0</w:t>
+        <w:t xml:space="preserve"> 0.2.3</w:t>
       </w:r>
     </w:p>
     <w:p>
@@ -85,7 +85,7 @@
       </w:r>
       <w:r>
         <w:rPr/>
-        <w:t xml:space="preserve"> 2026-08-17</w:t>
+        <w:t xml:space="preserve"> 2026-08-20</w:t>
       </w:r>
     </w:p>
     <w:p>
@@ -333,12 +333,12 @@
           <wp:inline distB="0" distL="0" distR="0" distT="0">
             <wp:extent cx="6629400" cy="4143375"/>
             <wp:effectExtent b="0" l="0" r="0" t="0"/>
-            <wp:docPr id="2" name="image-dCOnRRx-fioOFucqNzTu1.png"/>
+            <wp:docPr id="2" name="image-MQuD1EvF3gi6rS8y6dFhk.png"/>
             <a:graphic>
               <a:graphicData uri="http://schemas.openxmlformats.org/drawingml/2006/picture">
                 <pic:pic>
                   <pic:nvPicPr>
-                    <pic:cNvPr id="2" name="image-dCOnRRx-fioOFucqNzTu1.png" descr="Figure 1"/>
+                    <pic:cNvPr id="2" name="image-MQuD1EvF3gi6rS8y6dFhk.png" descr="Figure 1"/>
                     <pic:cNvPicPr/>
                   </pic:nvPicPr>
                   <pic:blipFill>
@@ -445,12 +445,12 @@
           <wp:inline distB="0" distL="0" distR="0" distT="0">
             <wp:extent cx="6629400" cy="4143375"/>
             <wp:effectExtent b="0" l="0" r="0" t="0"/>
-            <wp:docPr id="4" name="image-X1oGtokSUvJfmrU1qnT4J.png"/>
+            <wp:docPr id="4" name="image-wOyTax4aN6T5JuhZam15-.png"/>
             <a:graphic>
               <a:graphicData uri="http://schemas.openxmlformats.org/drawingml/2006/picture">
                 <pic:pic>
                   <pic:nvPicPr>
-                    <pic:cNvPr id="4" name="image-X1oGtokSUvJfmrU1qnT4J.png" descr="Figure 2"/>
+                    <pic:cNvPr id="4" name="image-wOyTax4aN6T5JuhZam15-.png" descr="Figure 2"/>
                     <pic:cNvPicPr/>
                   </pic:nvPicPr>
                   <pic:blipFill>
@@ -1812,12 +1812,12 @@
           <wp:inline distB="0" distL="0" distR="0" distT="0">
             <wp:extent cx="6629400" cy="4143375"/>
             <wp:effectExtent b="0" l="0" r="0" t="0"/>
-            <wp:docPr id="6" name="image-MC-5jAySgYLzbe34aLvGx.png"/>
+            <wp:docPr id="6" name="image-YDE-T4Eq_Z3xCcbU9400t.png"/>
             <a:graphic>
               <a:graphicData uri="http://schemas.openxmlformats.org/drawingml/2006/picture">
                 <pic:pic>
                   <pic:nvPicPr>
-                    <pic:cNvPr id="6" name="image-MC-5jAySgYLzbe34aLvGx.png" descr="Figure 4"/>
+                    <pic:cNvPr id="6" name="image-YDE-T4Eq_Z3xCcbU9400t.png" descr="Figure 4"/>
                     <pic:cNvPicPr/>
                   </pic:nvPicPr>
                   <pic:blipFill>
@@ -1998,12 +1998,12 @@
           <wp:inline distB="0" distL="0" distR="0" distT="0">
             <wp:extent cx="6629400" cy="6537325"/>
             <wp:effectExtent b="0" l="0" r="0" t="0"/>
-            <wp:docPr id="8" name="image-JMkNO1-z9STZehOS-2yBI.png"/>
+            <wp:docPr id="8" name="image-FQJFCq943kOr_YspHa4y2.png"/>
             <a:graphic>
               <a:graphicData uri="http://schemas.openxmlformats.org/drawingml/2006/picture">
                 <pic:pic>
                   <pic:nvPicPr>
-                    <pic:cNvPr id="8" name="image-JMkNO1-z9STZehOS-2yBI.png" descr="Figure 5"/>
+                    <pic:cNvPr id="8" name="image-FQJFCq943kOr_YspHa4y2.png" descr="Figure 5"/>
                     <pic:cNvPicPr/>
                   </pic:nvPicPr>
                   <pic:blipFill>
@@ -2131,12 +2131,12 @@
           <wp:inline distB="0" distL="0" distR="0" distT="0">
             <wp:extent cx="6629400" cy="4769485"/>
             <wp:effectExtent b="0" l="0" r="0" t="0"/>
-            <wp:docPr id="10" name="image-4uKSeIl20G9qCtLzelBmC.png"/>
+            <wp:docPr id="10" name="image-18Rdwu9ePh8molkdVytLq.png"/>
             <a:graphic>
               <a:graphicData uri="http://schemas.openxmlformats.org/drawingml/2006/picture">
                 <pic:pic>
                   <pic:nvPicPr>
-                    <pic:cNvPr id="10" name="image-4uKSeIl20G9qCtLzelBmC.png" descr="Figure 6"/>
+                    <pic:cNvPr id="10" name="image-18Rdwu9ePh8molkdVytLq.png" descr="Figure 6"/>
                     <pic:cNvPicPr/>
                   </pic:nvPicPr>
                   <pic:blipFill>
@@ -2221,12 +2221,12 @@
           <wp:inline distB="0" distL="0" distR="0" distT="0">
             <wp:extent cx="6629400" cy="4143375"/>
             <wp:effectExtent b="0" l="0" r="0" t="0"/>
-            <wp:docPr id="12" name="image-wA1FRPxv19PGY9NFz2pX4.png"/>
+            <wp:docPr id="12" name="image-hLQ_ahOC7ScMaBhpdmwZO.png"/>
             <a:graphic>
               <a:graphicData uri="http://schemas.openxmlformats.org/drawingml/2006/picture">
                 <pic:pic>
                   <pic:nvPicPr>
-                    <pic:cNvPr id="12" name="image-wA1FRPxv19PGY9NFz2pX4.png" descr="Figure 7"/>
+                    <pic:cNvPr id="12" name="image-hLQ_ahOC7ScMaBhpdmwZO.png" descr="Figure 7"/>
                     <pic:cNvPicPr/>
                   </pic:nvPicPr>
                   <pic:blipFill>
@@ -2424,12 +2424,12 @@
           <wp:inline distB="0" distL="0" distR="0" distT="0">
             <wp:extent cx="6629400" cy="4322921"/>
             <wp:effectExtent b="0" l="0" r="0" t="0"/>
-            <wp:docPr id="14" name="image-rqZZVNAgWd8yZip9Uv6mL.png"/>
+            <wp:docPr id="14" name="image--z67sIfd4uwvKerfL7v9_.png"/>
             <a:graphic>
               <a:graphicData uri="http://schemas.openxmlformats.org/drawingml/2006/picture">
                 <pic:pic>
                   <pic:nvPicPr>
-                    <pic:cNvPr id="14" name="image-rqZZVNAgWd8yZip9Uv6mL.png" descr="Figure 8"/>
+                    <pic:cNvPr id="14" name="image--z67sIfd4uwvKerfL7v9_.png" descr="Figure 8"/>
                     <pic:cNvPicPr/>
                   </pic:nvPicPr>
                   <pic:blipFill>

</xml_diff>